<commit_message>
Lab-3: Finalize deliverables with clean 4-page PDF report and balanced component diagrams
- PES1UG24AM920_SE_Lab3_Report.pdf: Professional 4-page academic PDF report
- PES1UG24AM920_SE_Lab3_Report.docx: Updated submission Word document
- Problem_Statement_48_Component_Diagram (.puml, .png, .pdf): Balanced UML 2.5 component diagram
- Coffee_Kiosk_Component_Diagram (.puml, .png, .pdf): Balanced UML 2.5 component diagram

Student: Arjun Srikanth (PES1UG24AM920)
</commit_message>
<xml_diff>
--- a/Lab-3/PES1UG24AM920_SE_Lab3_Report.docx
+++ b/Lab-3/PES1UG24AM920_SE_Lab3_Report.docx
@@ -8,31 +8,31 @@
       </w:pPr>
       <w:r>
         <w:rPr>
-          <w:rFonts w:ascii="Helvetica" w:hAnsi="Helvetica"/>
           <w:b/>
-          <w:color w:val="1B365D"/>
+          <w:color w:val="0C2340"/>
           <w:sz w:val="22"/>
         </w:rPr>
-        <w:t>DEPARTMENT OF COMPUTER SCIENCE &amp; ENGINEERING</w:t>
+        <w:t>Department of Computer Science &amp; Engineering</w:t>
         <w:br/>
-        <w:t>PES UNIVERSITY, BENGALURU</w:t>
+        <w:t>PES University, Bengaluru</w:t>
         <w:br/>
       </w:r>
-    </w:p>
-    <w:p>
-      <w:pPr>
-        <w:jc w:val="center"/>
-      </w:pPr>
       <w:r>
         <w:rPr>
-          <w:rFonts w:ascii="Helvetica" w:hAnsi="Helvetica"/>
           <w:b/>
           <w:color w:val="0C2340"/>
           <w:sz w:val="28"/>
         </w:rPr>
-        <w:t>SOFTWARE ENGINEERING LAB (SE LAB) — LAB 3 REPORT</w:t>
+        <w:t>Software Engineering Lab (SE Lab) — Lab 3 Report</w:t>
         <w:br/>
+      </w:r>
+      <w:r>
+        <w:rPr>
+          <w:color w:val="1E5180"/>
+          <w:sz w:val="21"/>
+        </w:rPr>
         <w:t>Component Modelling &amp; Architectural Pattern Selection</w:t>
+        <w:br/>
       </w:r>
     </w:p>
     <w:tbl>
@@ -41,17 +41,17 @@
         <w:jc w:val="center"/>
         <w:tblLook w:firstColumn="1" w:firstRow="1" w:lastColumn="0" w:lastRow="0" w:noHBand="0" w:noVBand="1" w:val="04A0"/>
         <w:tblBorders>
-          <w:top w:val="single" w:sz="4" w:space="0" w:color="CCCCCC"/>
-          <w:bottom w:val="single" w:sz="4" w:space="0" w:color="CCCCCC"/>
-          <w:insideH w:val="single" w:sz="4" w:space="0" w:color="EEEEEE"/>
+          <w:top w:val="single" w:sz="4" w:space="0" w:color="B0BEC5"/>
+          <w:bottom w:val="single" w:sz="4" w:space="0" w:color="B0BEC5"/>
+          <w:insideH w:val="single" w:sz="4" w:space="0" w:color="E0E0E0"/>
           <w:insideV w:val="none"/>
           <w:left w:val="none"/>
           <w:right w:val="none"/>
         </w:tblBorders>
       </w:tblPr>
       <w:tblGrid>
-        <w:gridCol w:w="5040"/>
-        <w:gridCol w:w="5040"/>
+        <w:gridCol w:w="5256"/>
+        <w:gridCol w:w="5256"/>
       </w:tblGrid>
       <w:tr>
         <w:tc>
@@ -67,7 +67,7 @@
               <w:rPr>
                 <w:b/>
                 <w:color w:val="1E5180"/>
-                <w:sz w:val="19"/>
+                <w:sz w:val="18"/>
               </w:rPr>
               <w:t>Student Name &amp; SRN</w:t>
             </w:r>
@@ -75,7 +75,7 @@
         </w:tc>
         <w:tc>
           <w:tcPr>
-            <w:tcW w:type="dxa" w:w="6912"/>
+            <w:tcW w:type="dxa" w:w="7200"/>
             <w:shd w:fill="FAFAFA"/>
           </w:tcPr>
           <w:p>
@@ -84,7 +84,7 @@
             </w:pPr>
             <w:r>
               <w:rPr>
-                <w:sz w:val="19"/>
+                <w:sz w:val="18"/>
               </w:rPr>
               <w:t>Arjun Srikanth  |  PES1UG24AM920 (Section H)</w:t>
             </w:r>
@@ -105,7 +105,7 @@
               <w:rPr>
                 <w:b/>
                 <w:color w:val="1E5180"/>
-                <w:sz w:val="19"/>
+                <w:sz w:val="18"/>
               </w:rPr>
               <w:t>Assigned Problem Statement</w:t>
             </w:r>
@@ -113,7 +113,7 @@
         </w:tc>
         <w:tc>
           <w:tcPr>
-            <w:tcW w:type="dxa" w:w="6912"/>
+            <w:tcW w:type="dxa" w:w="7200"/>
             <w:shd w:fill="FAFAFA"/>
           </w:tcPr>
           <w:p>
@@ -122,7 +122,7 @@
             </w:pPr>
             <w:r>
               <w:rPr>
-                <w:sz w:val="19"/>
+                <w:sz w:val="18"/>
               </w:rPr>
               <w:t>#48: Incident Escalation &amp; On-Call Rotation Engine</w:t>
             </w:r>
@@ -143,7 +143,7 @@
               <w:rPr>
                 <w:b/>
                 <w:color w:val="1E5180"/>
-                <w:sz w:val="19"/>
+                <w:sz w:val="18"/>
               </w:rPr>
               <w:t>Handout Scenario</w:t>
             </w:r>
@@ -151,7 +151,7 @@
         </w:tc>
         <w:tc>
           <w:tcPr>
-            <w:tcW w:type="dxa" w:w="6912"/>
+            <w:tcW w:type="dxa" w:w="7200"/>
             <w:shd w:fill="FAFAFA"/>
           </w:tcPr>
           <w:p>
@@ -160,7 +160,7 @@
             </w:pPr>
             <w:r>
               <w:rPr>
-                <w:sz w:val="19"/>
+                <w:sz w:val="18"/>
               </w:rPr>
               <w:t>Self-Service Coffee Kiosk System</w:t>
             </w:r>
@@ -181,7 +181,7 @@
               <w:rPr>
                 <w:b/>
                 <w:color w:val="1E5180"/>
-                <w:sz w:val="19"/>
+                <w:sz w:val="18"/>
               </w:rPr>
               <w:t>Domain &amp; Focus Area</w:t>
             </w:r>
@@ -189,7 +189,7 @@
         </w:tc>
         <w:tc>
           <w:tcPr>
-            <w:tcW w:type="dxa" w:w="6912"/>
+            <w:tcW w:type="dxa" w:w="7200"/>
             <w:shd w:fill="FAFAFA"/>
           </w:tcPr>
           <w:p>
@@ -198,7 +198,7 @@
             </w:pPr>
             <w:r>
               <w:rPr>
-                <w:sz w:val="19"/>
+                <w:sz w:val="18"/>
               </w:rPr>
               <w:t>Developer Tools &amp; IT Operations | Embedded Systems Architecture</w:t>
             </w:r>
@@ -219,7 +219,7 @@
               <w:rPr>
                 <w:b/>
                 <w:color w:val="1E5180"/>
-                <w:sz w:val="19"/>
+                <w:sz w:val="18"/>
               </w:rPr>
               <w:t>GitHub Repository</w:t>
             </w:r>
@@ -227,7 +227,7 @@
         </w:tc>
         <w:tc>
           <w:tcPr>
-            <w:tcW w:type="dxa" w:w="6912"/>
+            <w:tcW w:type="dxa" w:w="7200"/>
             <w:shd w:fill="FAFAFA"/>
           </w:tcPr>
           <w:p>
@@ -236,9 +236,9 @@
             </w:pPr>
             <w:r>
               <w:rPr>
-                <w:sz w:val="19"/>
+                <w:sz w:val="18"/>
               </w:rPr>
-              <w:t>https://github.com/arjunsrikanthh/PES1UG24AM920_se_lab</w:t>
+              <w:t>github.com/arjunsrikanthh/PES1UG24AM920_se_lab</w:t>
             </w:r>
           </w:p>
         </w:tc>
@@ -256,14 +256,14 @@
       <w:r>
         <w:rPr>
           <w:color w:val="0C2340"/>
-          <w:sz w:val="24"/>
+          <w:sz w:val="23"/>
         </w:rPr>
         <w:t>1. Comparative Analysis of Architectural Styles</w:t>
       </w:r>
     </w:p>
     <w:p>
       <w:r>
-        <w:t>Before selecting an architecture, three foundational architectural patterns were evaluated against the operational constraints and quality attributes required by modern enterprise and kiosk systems:</w:t>
+        <w:t>Before selecting an architectural pattern, three foundational styles were evaluated against system constraints, reliability targets, latency, and peripheral requirements:</w:t>
       </w:r>
     </w:p>
     <w:tbl>
@@ -272,19 +272,19 @@
         <w:jc w:val="center"/>
         <w:tblLook w:firstColumn="1" w:firstRow="1" w:lastColumn="0" w:lastRow="0" w:noHBand="0" w:noVBand="1" w:val="04A0"/>
         <w:tblBorders>
-          <w:top w:val="single" w:sz="4" w:space="0" w:color="CCCCCC"/>
-          <w:bottom w:val="single" w:sz="4" w:space="0" w:color="CCCCCC"/>
-          <w:insideH w:val="single" w:sz="4" w:space="0" w:color="EEEEEE"/>
+          <w:top w:val="single" w:sz="4" w:space="0" w:color="B0BEC5"/>
+          <w:bottom w:val="single" w:sz="4" w:space="0" w:color="B0BEC5"/>
+          <w:insideH w:val="single" w:sz="4" w:space="0" w:color="E0E0E0"/>
           <w:insideV w:val="none"/>
           <w:left w:val="none"/>
           <w:right w:val="none"/>
         </w:tblBorders>
       </w:tblPr>
       <w:tblGrid>
-        <w:gridCol w:w="2520"/>
-        <w:gridCol w:w="2520"/>
-        <w:gridCol w:w="2520"/>
-        <w:gridCol w:w="2520"/>
+        <w:gridCol w:w="2628"/>
+        <w:gridCol w:w="2628"/>
+        <w:gridCol w:w="2628"/>
+        <w:gridCol w:w="2628"/>
       </w:tblGrid>
       <w:tr>
         <w:tc>
@@ -300,9 +300,9 @@
               <w:rPr>
                 <w:b/>
                 <w:color w:val="FFFFFF"/>
-                <w:sz w:val="18"/>
+                <w:sz w:val="17"/>
               </w:rPr>
-              <w:t>Pattern</w:t>
+              <w:t>Architectural Style</w:t>
             </w:r>
           </w:p>
         </w:tc>
@@ -319,7 +319,7 @@
               <w:rPr>
                 <w:b/>
                 <w:color w:val="FFFFFF"/>
-                <w:sz w:val="18"/>
+                <w:sz w:val="17"/>
               </w:rPr>
               <w:t>Structural Organization</w:t>
             </w:r>
@@ -338,15 +338,15 @@
               <w:rPr>
                 <w:b/>
                 <w:color w:val="FFFFFF"/>
-                <w:sz w:val="18"/>
+                <w:sz w:val="17"/>
               </w:rPr>
-              <w:t>Key Strengths (Pros)</w:t>
+              <w:t>Key Advantages (Pros)</w:t>
             </w:r>
           </w:p>
         </w:tc>
         <w:tc>
           <w:tcPr>
-            <w:tcW w:type="dxa" w:w="2592"/>
+            <w:tcW w:type="dxa" w:w="2880"/>
             <w:shd w:fill="1E5180"/>
           </w:tcPr>
           <w:p>
@@ -357,7 +357,7 @@
               <w:rPr>
                 <w:b/>
                 <w:color w:val="FFFFFF"/>
-                <w:sz w:val="18"/>
+                <w:sz w:val="17"/>
               </w:rPr>
               <w:t>Key Limitations (Cons)</w:t>
             </w:r>
@@ -376,11 +376,9 @@
             </w:pPr>
             <w:r>
               <w:rPr>
-                <w:sz w:val="17"/>
+                <w:sz w:val="16"/>
               </w:rPr>
-              <w:t>Layered</w:t>
-              <w:br/>
-              <w:t>(N-Tier)</w:t>
+              <w:t>Layered (N-Tier)</w:t>
             </w:r>
           </w:p>
         </w:tc>
@@ -395,9 +393,9 @@
             </w:pPr>
             <w:r>
               <w:rPr>
-                <w:sz w:val="17"/>
+                <w:sz w:val="16"/>
               </w:rPr>
-              <w:t>Organized in horizontal tiers: Presentation, Business Logic, Data Access. Unidirectional call flow.</w:t>
+              <w:t>Horizontal tiers: Presentation, Business Logic, and Data Access with downward dependencies.</w:t>
             </w:r>
           </w:p>
         </w:tc>
@@ -412,19 +410,19 @@
             </w:pPr>
             <w:r>
               <w:rPr>
-                <w:sz w:val="17"/>
+                <w:sz w:val="16"/>
               </w:rPr>
               <w:t>• Clear separation of concerns</w:t>
               <w:br/>
-              <w:t>• Intuitive mental model</w:t>
+              <w:t>• Intuitive mental model &amp; testing</w:t>
               <w:br/>
-              <w:t>• Simple localized testing</w:t>
+              <w:t>• Low operational complexity</w:t>
             </w:r>
           </w:p>
         </w:tc>
         <w:tc>
           <w:tcPr>
-            <w:tcW w:type="dxa" w:w="2592"/>
+            <w:tcW w:type="dxa" w:w="2880"/>
             <w:shd w:fill="FFFFFF"/>
           </w:tcPr>
           <w:p>
@@ -433,7 +431,7 @@
             </w:pPr>
             <w:r>
               <w:rPr>
-                <w:sz w:val="17"/>
+                <w:sz w:val="16"/>
               </w:rPr>
               <w:t>• Performance sinkhole overhead</w:t>
               <w:br/>
@@ -456,7 +454,7 @@
             </w:pPr>
             <w:r>
               <w:rPr>
-                <w:sz w:val="17"/>
+                <w:sz w:val="16"/>
               </w:rPr>
               <w:t>Microservices</w:t>
             </w:r>
@@ -473,9 +471,9 @@
             </w:pPr>
             <w:r>
               <w:rPr>
-                <w:sz w:val="17"/>
+                <w:sz w:val="16"/>
               </w:rPr>
-              <w:t>Decoupled autonomous services around business capabilities, interacting via gRPC/REST/event brokers.</w:t>
+              <w:t>Decoupled autonomous services structured around business domains, interacting via gRPC/REST/broker.</w:t>
             </w:r>
           </w:p>
         </w:tc>
@@ -490,19 +488,19 @@
             </w:pPr>
             <w:r>
               <w:rPr>
-                <w:sz w:val="17"/>
+                <w:sz w:val="16"/>
               </w:rPr>
               <w:t>• Fault isolation prevents cascades</w:t>
               <w:br/>
-              <w:t>• Independent horizontal scaling</w:t>
+              <w:t>• Targeted horizontal autoscaling</w:t>
               <w:br/>
-              <w:t>• Technology stack flexibility</w:t>
+              <w:t>• Independent service deployments</w:t>
             </w:r>
           </w:p>
         </w:tc>
         <w:tc>
           <w:tcPr>
-            <w:tcW w:type="dxa" w:w="2592"/>
+            <w:tcW w:type="dxa" w:w="2880"/>
             <w:shd w:fill="F8F9FA"/>
           </w:tcPr>
           <w:p>
@@ -511,13 +509,13 @@
             </w:pPr>
             <w:r>
               <w:rPr>
-                <w:sz w:val="17"/>
+                <w:sz w:val="16"/>
               </w:rPr>
-              <w:t>• Distributed systems complexity</w:t>
+              <w:t>• High operational/network overhead</w:t>
               <w:br/>
-              <w:t>• Eventual consistency overhead</w:t>
+              <w:t>• Eventual consistency challenges</w:t>
               <w:br/>
-              <w:t>• Complex telemetry &amp; tracing</w:t>
+              <w:t>• Complex distributed telemetry</w:t>
             </w:r>
           </w:p>
         </w:tc>
@@ -534,7 +532,7 @@
             </w:pPr>
             <w:r>
               <w:rPr>
-                <w:sz w:val="17"/>
+                <w:sz w:val="16"/>
               </w:rPr>
               <w:t>Client-Server</w:t>
             </w:r>
@@ -551,9 +549,9 @@
             </w:pPr>
             <w:r>
               <w:rPr>
-                <w:sz w:val="17"/>
+                <w:sz w:val="16"/>
               </w:rPr>
-              <w:t>Centralized application/database server serving thin or rich distributed client nodes.</w:t>
+              <w:t>Centralized server executing business logic &amp; data access, serving distributed client nodes.</w:t>
             </w:r>
           </w:p>
         </w:tc>
@@ -568,19 +566,19 @@
             </w:pPr>
             <w:r>
               <w:rPr>
-                <w:sz w:val="17"/>
+                <w:sz w:val="16"/>
               </w:rPr>
-              <w:t>• Centralized governance &amp; rules</w:t>
+              <w:t>• Centralized state governance</w:t>
               <w:br/>
-              <w:t>• Direct ACID transactions</w:t>
+              <w:t>• Guaranteed ACID consistency</w:t>
               <w:br/>
-              <w:t>• Simpler client hardware needs</w:t>
+              <w:t>• Lightweight client compute</w:t>
             </w:r>
           </w:p>
         </w:tc>
         <w:tc>
           <w:tcPr>
-            <w:tcW w:type="dxa" w:w="2592"/>
+            <w:tcW w:type="dxa" w:w="2880"/>
             <w:shd w:fill="FFFFFF"/>
           </w:tcPr>
           <w:p>
@@ -589,13 +587,13 @@
             </w:pPr>
             <w:r>
               <w:rPr>
-                <w:sz w:val="17"/>
+                <w:sz w:val="16"/>
               </w:rPr>
-              <w:t>• Server is Single Point of Failure</w:t>
+              <w:t>• Single Point of Failure (SPOF)</w:t>
+              <w:br/>
+              <w:t>• Scalability bottleneck under surge</w:t>
               <w:br/>
               <w:t>• Network partition locks clients</w:t>
-              <w:br/>
-              <w:t>• Scalability bottleneck under peak</w:t>
             </w:r>
           </w:p>
         </w:tc>
@@ -613,9 +611,9 @@
       <w:r>
         <w:rPr>
           <w:color w:val="0C2340"/>
-          <w:sz w:val="24"/>
+          <w:sz w:val="23"/>
         </w:rPr>
-        <w:t>2. Assigned Scenario (Problem Statement #48): Incident Escalation &amp; On-Call Rotation Engine</w:t>
+        <w:t>2. Assigned Scenario (Problem Statement #48): Incident Escalation Engine</w:t>
       </w:r>
     </w:p>
     <w:p>
@@ -649,27 +647,27 @@
         <w:t xml:space="preserve">• Architectural Choice: </w:t>
       </w:r>
       <w:r>
-        <w:t>An Event-Driven Microservices Architecture partitioned into 6 domain-aligned microservices communicating asynchronously over gRPC and an event bus (Kafka/RabbitMQ), backed by partitioned transactional stores.</w:t>
+        <w:t>Event-Driven Microservices Architecture comprising 6 autonomous containerized services communicating asynchronously via gRPC and event message streams, backed by PostgreSQL and Redis.</w:t>
         <w:br/>
       </w:r>
       <w:r>
         <w:rPr>
           <w:b/>
         </w:rPr>
-        <w:t xml:space="preserve">• Scenario-Related Reason 1 (Fault Isolation During Major Outages): </w:t>
+        <w:t xml:space="preserve">• Reason 1 (Fault Isolation): </w:t>
       </w:r>
       <w:r>
-        <w:t>During catastrophic P1 incidents, monitoring clusters emit alert floods (&gt;= 500 alerts/sec). If external telecom carrier gateways (Twilio Voice/SMS) encounter rate limits or transient degradation, the Multi-Channel Notification Service buffers dispatch events without degrading the Webhook Ingestion Gateway or stalling the Escalation Engine timers.</w:t>
+        <w:t>In P1 production incidents, observability systems flood alerts (&gt;= 500/sec). Decoupling Notification Service prevents telecom carrier rate limits (Twilio Voice/SMS) from stalling the Ingestion Gateway or freezing SLA timers.</w:t>
         <w:br/>
       </w:r>
       <w:r>
         <w:rPr>
           <w:b/>
         </w:rPr>
-        <w:t xml:space="preserve">• Scenario-Related Reason 2 (Targeted Independent Scaling): </w:t>
+        <w:t xml:space="preserve">• Reason 2 (Targeted Autoscaling): </w:t>
       </w:r>
       <w:r>
-        <w:t>Alert ingestion workloads are highly bursty and volatile, while schedule management and escalation policy edits are infrequent administrative transactions. Microservices allow autoscaling solely the Ingestion and Notification containers during surges, satisfying NFR-001 (initiating alert dispatch within 3 seconds) cost-effectively.</w:t>
+        <w:t>Alert ingestion experiences volatile bursts, while rotation schedule administration is low-frequency and read-heavy. Microservices permit autoscaling solely Ingestion and Notification pods to meet the &lt; 3s dispatch SLA (NFR-001).</w:t>
         <w:br/>
       </w:r>
       <w:r>
@@ -679,7 +677,7 @@
         <w:t xml:space="preserve">• Security Advantage: </w:t>
       </w:r>
       <w:r>
-        <w:t>Zero-trust network segregation isolates external-facing ingestion webhooks from internal business logic. Payloads require HMAC-SHA256 signature verification at the gateway before admittance. Internal service-to-service communications are encrypted via mutual TLS (mTLS), and sensitive engineer phone/email data is strictly compartmentalized within the notification worker, satisfying NFR-002.</w:t>
+        <w:t>Zero-Trust DMZ perimeter enforces HMAC-SHA256 signature verification. Inter-service links use mutual TLS (mTLS). Sensitive engineer contact details are restricted to Notification Service with AES-256 field encryption (NFR-002).</w:t>
         <w:br/>
       </w:r>
       <w:r>
@@ -689,7 +687,7 @@
         <w:t xml:space="preserve">• Performance Benefit: </w:t>
       </w:r>
       <w:r>
-        <w:t>Sub-100ms asynchronous webhook ingestion acknowledgment. Decoupling alert ingestion from downstream rotation queries and notification dispatch prevents blocking on synchronous telecom I/O, guaranteeing end-to-end alert dispatch initiation under 3 seconds under peak concurrent loads.</w:t>
+        <w:t>Ingress webhooks acknowledge within &lt; 100ms. Decoupled asynchronous workers dispatch multi-channel alerts (phone, SMS, email) concurrently within 3 seconds under peak load.</w:t>
         <w:br/>
       </w:r>
     </w:p>
@@ -705,7 +703,7 @@
       <w:r>
         <w:drawing>
           <wp:inline xmlns:a="http://schemas.openxmlformats.org/drawingml/2006/main" xmlns:pic="http://schemas.openxmlformats.org/drawingml/2006/picture">
-            <wp:extent cx="6217920" cy="4929893"/>
+            <wp:extent cx="6400800" cy="3250689"/>
             <wp:docPr id="1" name="Picture 1"/>
             <wp:cNvGraphicFramePr>
               <a:graphicFrameLocks noChangeAspect="1"/>
@@ -726,7 +724,7 @@
                   <pic:spPr>
                     <a:xfrm>
                       <a:off x="0" y="0"/>
-                      <a:ext cx="6217920" cy="4929893"/>
+                      <a:ext cx="6400800" cy="3250689"/>
                     </a:xfrm>
                     <a:prstGeom prst="rect"/>
                   </pic:spPr>
@@ -737,545 +735,6 @@
         </w:drawing>
       </w:r>
     </w:p>
-    <w:p>
-      <w:pPr>
-        <w:jc w:val="center"/>
-      </w:pPr>
-      <w:r>
-        <w:rPr>
-          <w:i/>
-          <w:sz w:val="17"/>
-        </w:rPr>
-        <w:t>Figure 1: UML Component Diagram for Incident Escalation &amp; On-Call Rotation Engine (6 components, 8 ball-and-socket interfaces)</w:t>
-      </w:r>
-    </w:p>
-    <w:p>
-      <w:pPr>
-        <w:pStyle w:val="Heading2"/>
-      </w:pPr>
-      <w:r>
-        <w:t>Component &amp; Interface Dictionary (Problem Statement #48)</w:t>
-      </w:r>
-    </w:p>
-    <w:tbl>
-      <w:tblPr>
-        <w:tblW w:type="auto" w:w="0"/>
-        <w:jc w:val="center"/>
-        <w:tblLook w:firstColumn="1" w:firstRow="1" w:lastColumn="0" w:lastRow="0" w:noHBand="0" w:noVBand="1" w:val="04A0"/>
-        <w:tblBorders>
-          <w:top w:val="single" w:sz="4" w:space="0" w:color="CCCCCC"/>
-          <w:bottom w:val="single" w:sz="4" w:space="0" w:color="CCCCCC"/>
-          <w:insideH w:val="single" w:sz="4" w:space="0" w:color="EEEEEE"/>
-          <w:insideV w:val="none"/>
-          <w:left w:val="none"/>
-          <w:right w:val="none"/>
-        </w:tblBorders>
-      </w:tblPr>
-      <w:tblGrid>
-        <w:gridCol w:w="2520"/>
-        <w:gridCol w:w="2520"/>
-        <w:gridCol w:w="2520"/>
-        <w:gridCol w:w="2520"/>
-      </w:tblGrid>
-      <w:tr>
-        <w:tc>
-          <w:tcPr>
-            <w:tcW w:type="dxa" w:w="2592"/>
-            <w:shd w:fill="1E5180"/>
-          </w:tcPr>
-          <w:p>
-            <w:pPr>
-              <w:jc w:val="center"/>
-            </w:pPr>
-            <w:r>
-              <w:rPr>
-                <w:b/>
-                <w:color w:val="FFFFFF"/>
-                <w:sz w:val="17"/>
-              </w:rPr>
-              <w:t>Component Name</w:t>
-            </w:r>
-          </w:p>
-        </w:tc>
-        <w:tc>
-          <w:tcPr>
-            <w:tcW w:type="dxa" w:w="1584"/>
-            <w:shd w:fill="1E5180"/>
-          </w:tcPr>
-          <w:p>
-            <w:pPr>
-              <w:jc w:val="center"/>
-            </w:pPr>
-            <w:r>
-              <w:rPr>
-                <w:b/>
-                <w:color w:val="FFFFFF"/>
-                <w:sz w:val="17"/>
-              </w:rPr>
-              <w:t>Stereotype</w:t>
-            </w:r>
-          </w:p>
-        </w:tc>
-        <w:tc>
-          <w:tcPr>
-            <w:tcW w:type="dxa" w:w="2880"/>
-            <w:shd w:fill="1E5180"/>
-          </w:tcPr>
-          <w:p>
-            <w:pPr>
-              <w:jc w:val="center"/>
-            </w:pPr>
-            <w:r>
-              <w:rPr>
-                <w:b/>
-                <w:color w:val="FFFFFF"/>
-                <w:sz w:val="17"/>
-              </w:rPr>
-              <w:t>Provided Interfaces (Ball)</w:t>
-            </w:r>
-          </w:p>
-        </w:tc>
-        <w:tc>
-          <w:tcPr>
-            <w:tcW w:type="dxa" w:w="3024"/>
-            <w:shd w:fill="1E5180"/>
-          </w:tcPr>
-          <w:p>
-            <w:pPr>
-              <w:jc w:val="center"/>
-            </w:pPr>
-            <w:r>
-              <w:rPr>
-                <w:b/>
-                <w:color w:val="FFFFFF"/>
-                <w:sz w:val="17"/>
-              </w:rPr>
-              <w:t>Required Interfaces (Socket)</w:t>
-            </w:r>
-          </w:p>
-        </w:tc>
-      </w:tr>
-      <w:tr>
-        <w:tc>
-          <w:tcPr>
-            <w:tcW w:type="dxa" w:w="2592"/>
-            <w:shd w:fill="FFFFFF"/>
-          </w:tcPr>
-          <w:p>
-            <w:pPr>
-              <w:spacing w:after="40"/>
-            </w:pPr>
-            <w:r>
-              <w:rPr>
-                <w:sz w:val="16"/>
-              </w:rPr>
-              <w:t>Webhook Ingestion Gateway</w:t>
-            </w:r>
-          </w:p>
-        </w:tc>
-        <w:tc>
-          <w:tcPr>
-            <w:tcW w:type="dxa" w:w="1584"/>
-            <w:shd w:fill="FFFFFF"/>
-          </w:tcPr>
-          <w:p>
-            <w:pPr>
-              <w:spacing w:after="40"/>
-            </w:pPr>
-            <w:r>
-              <w:rPr>
-                <w:sz w:val="16"/>
-              </w:rPr>
-              <w:t>&lt;&lt;component&gt;&gt;</w:t>
-            </w:r>
-          </w:p>
-        </w:tc>
-        <w:tc>
-          <w:tcPr>
-            <w:tcW w:type="dxa" w:w="2880"/>
-            <w:shd w:fill="FFFFFF"/>
-          </w:tcPr>
-          <w:p>
-            <w:pPr>
-              <w:spacing w:after="40"/>
-            </w:pPr>
-            <w:r>
-              <w:rPr>
-                <w:sz w:val="16"/>
-              </w:rPr>
-              <w:t>IAlertWebhook (HTTPS POST)</w:t>
-            </w:r>
-          </w:p>
-        </w:tc>
-        <w:tc>
-          <w:tcPr>
-            <w:tcW w:type="dxa" w:w="3024"/>
-            <w:shd w:fill="FFFFFF"/>
-          </w:tcPr>
-          <w:p>
-            <w:pPr>
-              <w:spacing w:after="40"/>
-            </w:pPr>
-            <w:r>
-              <w:rPr>
-                <w:sz w:val="16"/>
-              </w:rPr>
-              <w:t>IEscalationControl (Event bus)</w:t>
-            </w:r>
-          </w:p>
-        </w:tc>
-      </w:tr>
-      <w:tr>
-        <w:tc>
-          <w:tcPr>
-            <w:tcW w:type="dxa" w:w="2592"/>
-            <w:shd w:fill="F8F9FA"/>
-          </w:tcPr>
-          <w:p>
-            <w:pPr>
-              <w:spacing w:after="40"/>
-            </w:pPr>
-            <w:r>
-              <w:rPr>
-                <w:sz w:val="16"/>
-              </w:rPr>
-              <w:t>Rotation &amp; Schedule Manager</w:t>
-            </w:r>
-          </w:p>
-        </w:tc>
-        <w:tc>
-          <w:tcPr>
-            <w:tcW w:type="dxa" w:w="1584"/>
-            <w:shd w:fill="F8F9FA"/>
-          </w:tcPr>
-          <w:p>
-            <w:pPr>
-              <w:spacing w:after="40"/>
-            </w:pPr>
-            <w:r>
-              <w:rPr>
-                <w:sz w:val="16"/>
-              </w:rPr>
-              <w:t>&lt;&lt;component&gt;&gt;</w:t>
-            </w:r>
-          </w:p>
-        </w:tc>
-        <w:tc>
-          <w:tcPr>
-            <w:tcW w:type="dxa" w:w="2880"/>
-            <w:shd w:fill="F8F9FA"/>
-          </w:tcPr>
-          <w:p>
-            <w:pPr>
-              <w:spacing w:after="40"/>
-            </w:pPr>
-            <w:r>
-              <w:rPr>
-                <w:sz w:val="16"/>
-              </w:rPr>
-              <w:t>IScheduleLookup, IRotationConfig</w:t>
-            </w:r>
-          </w:p>
-        </w:tc>
-        <w:tc>
-          <w:tcPr>
-            <w:tcW w:type="dxa" w:w="3024"/>
-            <w:shd w:fill="F8F9FA"/>
-          </w:tcPr>
-          <w:p>
-            <w:pPr>
-              <w:spacing w:after="40"/>
-            </w:pPr>
-            <w:r>
-              <w:rPr>
-                <w:sz w:val="16"/>
-              </w:rPr>
-              <w:t>ISqlPersistence (PostgreSQL)</w:t>
-            </w:r>
-          </w:p>
-        </w:tc>
-      </w:tr>
-      <w:tr>
-        <w:tc>
-          <w:tcPr>
-            <w:tcW w:type="dxa" w:w="2592"/>
-            <w:shd w:fill="FFFFFF"/>
-          </w:tcPr>
-          <w:p>
-            <w:pPr>
-              <w:spacing w:after="40"/>
-            </w:pPr>
-            <w:r>
-              <w:rPr>
-                <w:sz w:val="16"/>
-              </w:rPr>
-              <w:t>Escalation &amp; Rules Engine</w:t>
-            </w:r>
-          </w:p>
-        </w:tc>
-        <w:tc>
-          <w:tcPr>
-            <w:tcW w:type="dxa" w:w="1584"/>
-            <w:shd w:fill="FFFFFF"/>
-          </w:tcPr>
-          <w:p>
-            <w:pPr>
-              <w:spacing w:after="40"/>
-            </w:pPr>
-            <w:r>
-              <w:rPr>
-                <w:sz w:val="16"/>
-              </w:rPr>
-              <w:t>&lt;&lt;component&gt;&gt;</w:t>
-            </w:r>
-          </w:p>
-        </w:tc>
-        <w:tc>
-          <w:tcPr>
-            <w:tcW w:type="dxa" w:w="2880"/>
-            <w:shd w:fill="FFFFFF"/>
-          </w:tcPr>
-          <w:p>
-            <w:pPr>
-              <w:spacing w:after="40"/>
-            </w:pPr>
-            <w:r>
-              <w:rPr>
-                <w:sz w:val="16"/>
-              </w:rPr>
-              <w:t>IEscalationControl (RPC/Timer)</w:t>
-            </w:r>
-          </w:p>
-        </w:tc>
-        <w:tc>
-          <w:tcPr>
-            <w:tcW w:type="dxa" w:w="3024"/>
-            <w:shd w:fill="FFFFFF"/>
-          </w:tcPr>
-          <w:p>
-            <w:pPr>
-              <w:spacing w:after="40"/>
-            </w:pPr>
-            <w:r>
-              <w:rPr>
-                <w:sz w:val="16"/>
-              </w:rPr>
-              <w:t>IScheduleLookup, INotifyDispatch, ISqlPersistence</w:t>
-            </w:r>
-          </w:p>
-        </w:tc>
-      </w:tr>
-      <w:tr>
-        <w:tc>
-          <w:tcPr>
-            <w:tcW w:type="dxa" w:w="2592"/>
-            <w:shd w:fill="F8F9FA"/>
-          </w:tcPr>
-          <w:p>
-            <w:pPr>
-              <w:spacing w:after="40"/>
-            </w:pPr>
-            <w:r>
-              <w:rPr>
-                <w:sz w:val="16"/>
-              </w:rPr>
-              <w:t>Multi-Channel Notification Service</w:t>
-            </w:r>
-          </w:p>
-        </w:tc>
-        <w:tc>
-          <w:tcPr>
-            <w:tcW w:type="dxa" w:w="1584"/>
-            <w:shd w:fill="F8F9FA"/>
-          </w:tcPr>
-          <w:p>
-            <w:pPr>
-              <w:spacing w:after="40"/>
-            </w:pPr>
-            <w:r>
-              <w:rPr>
-                <w:sz w:val="16"/>
-              </w:rPr>
-              <w:t>&lt;&lt;component&gt;&gt;</w:t>
-            </w:r>
-          </w:p>
-        </w:tc>
-        <w:tc>
-          <w:tcPr>
-            <w:tcW w:type="dxa" w:w="2880"/>
-            <w:shd w:fill="F8F9FA"/>
-          </w:tcPr>
-          <w:p>
-            <w:pPr>
-              <w:spacing w:after="40"/>
-            </w:pPr>
-            <w:r>
-              <w:rPr>
-                <w:sz w:val="16"/>
-              </w:rPr>
-              <w:t>INotifyDispatch (Async queue)</w:t>
-            </w:r>
-          </w:p>
-        </w:tc>
-        <w:tc>
-          <w:tcPr>
-            <w:tcW w:type="dxa" w:w="3024"/>
-            <w:shd w:fill="F8F9FA"/>
-          </w:tcPr>
-          <w:p>
-            <w:pPr>
-              <w:spacing w:after="40"/>
-            </w:pPr>
-            <w:r>
-              <w:rPr>
-                <w:sz w:val="16"/>
-              </w:rPr>
-              <w:t>ITelecomGateway (Twilio Voice/SMS/SMTP)</w:t>
-            </w:r>
-          </w:p>
-        </w:tc>
-      </w:tr>
-      <w:tr>
-        <w:tc>
-          <w:tcPr>
-            <w:tcW w:type="dxa" w:w="2592"/>
-            <w:shd w:fill="FFFFFF"/>
-          </w:tcPr>
-          <w:p>
-            <w:pPr>
-              <w:spacing w:after="40"/>
-            </w:pPr>
-            <w:r>
-              <w:rPr>
-                <w:sz w:val="16"/>
-              </w:rPr>
-              <w:t>Triage &amp; Incident Lifecycle Manager</w:t>
-            </w:r>
-          </w:p>
-        </w:tc>
-        <w:tc>
-          <w:tcPr>
-            <w:tcW w:type="dxa" w:w="1584"/>
-            <w:shd w:fill="FFFFFF"/>
-          </w:tcPr>
-          <w:p>
-            <w:pPr>
-              <w:spacing w:after="40"/>
-            </w:pPr>
-            <w:r>
-              <w:rPr>
-                <w:sz w:val="16"/>
-              </w:rPr>
-              <w:t>&lt;&lt;component&gt;&gt;</w:t>
-            </w:r>
-          </w:p>
-        </w:tc>
-        <w:tc>
-          <w:tcPr>
-            <w:tcW w:type="dxa" w:w="2880"/>
-            <w:shd w:fill="FFFFFF"/>
-          </w:tcPr>
-          <w:p>
-            <w:pPr>
-              <w:spacing w:after="40"/>
-            </w:pPr>
-            <w:r>
-              <w:rPr>
-                <w:sz w:val="16"/>
-              </w:rPr>
-              <w:t>IDashboardAPI, IRemoteTriageWebhook</w:t>
-            </w:r>
-          </w:p>
-        </w:tc>
-        <w:tc>
-          <w:tcPr>
-            <w:tcW w:type="dxa" w:w="3024"/>
-            <w:shd w:fill="FFFFFF"/>
-          </w:tcPr>
-          <w:p>
-            <w:pPr>
-              <w:spacing w:after="40"/>
-            </w:pPr>
-            <w:r>
-              <w:rPr>
-                <w:sz w:val="16"/>
-              </w:rPr>
-              <w:t>IEscalationControl, IPostMortemTrigger</w:t>
-            </w:r>
-          </w:p>
-        </w:tc>
-      </w:tr>
-      <w:tr>
-        <w:tc>
-          <w:tcPr>
-            <w:tcW w:type="dxa" w:w="2592"/>
-            <w:shd w:fill="F8F9FA"/>
-          </w:tcPr>
-          <w:p>
-            <w:pPr>
-              <w:spacing w:after="40"/>
-            </w:pPr>
-            <w:r>
-              <w:rPr>
-                <w:sz w:val="16"/>
-              </w:rPr>
-              <w:t>Post-Mortem &amp; Telemetry Store</w:t>
-            </w:r>
-          </w:p>
-        </w:tc>
-        <w:tc>
-          <w:tcPr>
-            <w:tcW w:type="dxa" w:w="1584"/>
-            <w:shd w:fill="F8F9FA"/>
-          </w:tcPr>
-          <w:p>
-            <w:pPr>
-              <w:spacing w:after="40"/>
-            </w:pPr>
-            <w:r>
-              <w:rPr>
-                <w:sz w:val="16"/>
-              </w:rPr>
-              <w:t>&lt;&lt;component&gt;&gt;</w:t>
-            </w:r>
-          </w:p>
-        </w:tc>
-        <w:tc>
-          <w:tcPr>
-            <w:tcW w:type="dxa" w:w="2880"/>
-            <w:shd w:fill="F8F9FA"/>
-          </w:tcPr>
-          <w:p>
-            <w:pPr>
-              <w:spacing w:after="40"/>
-            </w:pPr>
-            <w:r>
-              <w:rPr>
-                <w:sz w:val="16"/>
-              </w:rPr>
-              <w:t>IPostMortemTrigger (Event)</w:t>
-            </w:r>
-          </w:p>
-        </w:tc>
-        <w:tc>
-          <w:tcPr>
-            <w:tcW w:type="dxa" w:w="3024"/>
-            <w:shd w:fill="F8F9FA"/>
-          </w:tcPr>
-          <w:p>
-            <w:pPr>
-              <w:spacing w:after="40"/>
-            </w:pPr>
-            <w:r>
-              <w:rPr>
-                <w:sz w:val="16"/>
-              </w:rPr>
-              <w:t>ISqlPersistence (Encrypted audit log)</w:t>
-            </w:r>
-          </w:p>
-        </w:tc>
-      </w:tr>
-    </w:tbl>
     <w:p>
       <w:r>
         <w:br w:type="page"/>
@@ -1288,7 +747,7 @@
       <w:r>
         <w:rPr>
           <w:color w:val="0C2340"/>
-          <w:sz w:val="24"/>
+          <w:sz w:val="23"/>
         </w:rPr>
         <w:t>3. Handout Scenario: Self-Service Coffee Kiosk System</w:t>
       </w:r>
@@ -1324,27 +783,27 @@
         <w:t xml:space="preserve">• Architectural Choice: </w:t>
       </w:r>
       <w:r>
-        <w:t>A Layered Component-Based Architecture organized into Presentation (Touchscreen UI), Business Logic (Order Manager &amp; Menu Catalog), and Hardware Abstraction (Payment Service &amp; Printer Controller) deployed locally on embedded kiosk hardware.</w:t>
+        <w:t>Layered Component-Based Architecture partitioned into Presentation (Touchscreen UI), Business Logic (Order Manager &amp; Menu Catalog), and Hardware Integration (Payment Service &amp; Printer Controller) hosted on kiosk hardware.</w:t>
         <w:br/>
       </w:r>
       <w:r>
         <w:rPr>
           <w:b/>
         </w:rPr>
-        <w:t xml:space="preserve">• Scenario-Related Reason 1 (Hardware-Software Locality &amp; Peripheral Control): </w:t>
+        <w:t xml:space="preserve">• Reason 1 (Hardware-Software Locality): </w:t>
       </w:r>
       <w:r>
-        <w:t>The kiosk operates as a single physical standalone terminal connected to local peripherals (touchscreen, EMV chip card reader, and ESC/POS thermal receipt printer). A layered component architecture maintains hardware drivers locally, avoiding network latency and network partition risks when handling serial card swipes and printing.</w:t>
+        <w:t>The kiosk is an integrated terminal connected to local hardware (touchscreen, EMV card reader, thermal receipt printer). Layered architecture handles low-level USB/Serial IO directly without network dependency.</w:t>
         <w:br/>
       </w:r>
       <w:r>
         <w:rPr>
           <w:b/>
         </w:rPr>
-        <w:t xml:space="preserve">• Scenario-Related Reason 2 (Deterministic Sequential Ordering Lifecycle): </w:t>
+        <w:t xml:space="preserve">• Reason 2 (Deterministic Sequential Flow): </w:t>
       </w:r>
       <w:r>
-        <w:t>Customer interactions follow an atomic linear state machine: Beverage Selection (Espresso/Americano/Latte) -&gt; Size Selection (Small/Large) -&gt; Card Authorization -&gt; Receipt Dispensing. The Order Manager orchestrates this flow with strict state transitions without distributed transaction overhead.</w:t>
+        <w:t>Ordering follows an atomic sequential lifecycle: Select Coffee (Espresso/Latte/Americano) -&gt; Select Size (Small/Large) -&gt; Authorize Card -&gt; Print Receipt. The Order Manager coordinates this flow without distributed transaction overhead.</w:t>
         <w:br/>
       </w:r>
       <w:r>
@@ -1354,7 +813,7 @@
         <w:t xml:space="preserve">• Security Advantage: </w:t>
       </w:r>
       <w:r>
-        <w:t>PCI-DSS Compliance Scope Minimization via Hardware Sandboxing. The Payment Service Component interfaces directly with the EMV PIN-pad hardware via encrypted serial protocol and connects to the banking gateway via TLS 1.3. Credit card numbers and PIN blocks never enter the Order Manager or UI memory space, protecting customer payment security.</w:t>
+        <w:t>PCI-DSS Scope Minimization via Hardware Sandboxing. Payment Service interfaces directly with EMV PIN-pad hardware via encrypted serial IO and talks to bank gateway over TLS 1.3. Card numbers/PINs never enter Order Manager or UI memory space.</w:t>
         <w:br/>
       </w:r>
       <w:r>
@@ -1364,7 +823,7 @@
         <w:t xml:space="preserve">• Performance Benefit: </w:t>
       </w:r>
       <w:r>
-        <w:t>Zero-Latency Touch Screen Responsiveness &amp; Fast Printing. Menu and pricing data are cached in local memory, enabling instantaneous UI updates (&lt; 16ms, 60fps) during customer ordering. In addition, the Printer Controller directly streams binary ESC/POS bytecode over USB/Serial, dispensing receipts in under 1 second following payment confirmation.</w:t>
+        <w:t>Zero-Latency Touch UI &amp; Instant Receipts. Menu and pricing data are cached locally for &lt; 16ms UI responsiveness. The Printer Controller directly streams binary ESC/POS bytecode, dispensing receipts in &lt; 1s after payment authorization.</w:t>
         <w:br/>
       </w:r>
     </w:p>
@@ -1380,7 +839,7 @@
       <w:r>
         <w:drawing>
           <wp:inline xmlns:a="http://schemas.openxmlformats.org/drawingml/2006/main" xmlns:pic="http://schemas.openxmlformats.org/drawingml/2006/picture">
-            <wp:extent cx="6217920" cy="1625539"/>
+            <wp:extent cx="6400800" cy="2738120"/>
             <wp:docPr id="2" name="Picture 2"/>
             <wp:cNvGraphicFramePr>
               <a:graphicFrameLocks noChangeAspect="1"/>
@@ -1401,7 +860,7 @@
                   <pic:spPr>
                     <a:xfrm>
                       <a:off x="0" y="0"/>
-                      <a:ext cx="6217920" cy="1625539"/>
+                      <a:ext cx="6400800" cy="2738120"/>
                     </a:xfrm>
                     <a:prstGeom prst="rect"/>
                   </pic:spPr>
@@ -1412,478 +871,9 @@
         </w:drawing>
       </w:r>
     </w:p>
-    <w:p>
-      <w:pPr>
-        <w:jc w:val="center"/>
-      </w:pPr>
-      <w:r>
-        <w:rPr>
-          <w:i/>
-          <w:sz w:val="17"/>
-        </w:rPr>
-        <w:t>Figure 2: UML Component Diagram for Self-Service Coffee Kiosk System (5 components, 8 ball-and-socket interfaces)</w:t>
-      </w:r>
-    </w:p>
-    <w:p>
-      <w:pPr>
-        <w:pStyle w:val="Heading2"/>
-      </w:pPr>
-      <w:r>
-        <w:t>Component &amp; Interface Dictionary (Coffee Kiosk System)</w:t>
-      </w:r>
-    </w:p>
-    <w:tbl>
-      <w:tblPr>
-        <w:tblW w:type="auto" w:w="0"/>
-        <w:jc w:val="center"/>
-        <w:tblLook w:firstColumn="1" w:firstRow="1" w:lastColumn="0" w:lastRow="0" w:noHBand="0" w:noVBand="1" w:val="04A0"/>
-        <w:tblBorders>
-          <w:top w:val="single" w:sz="4" w:space="0" w:color="CCCCCC"/>
-          <w:bottom w:val="single" w:sz="4" w:space="0" w:color="CCCCCC"/>
-          <w:insideH w:val="single" w:sz="4" w:space="0" w:color="EEEEEE"/>
-          <w:insideV w:val="none"/>
-          <w:left w:val="none"/>
-          <w:right w:val="none"/>
-        </w:tblBorders>
-      </w:tblPr>
-      <w:tblGrid>
-        <w:gridCol w:w="2520"/>
-        <w:gridCol w:w="2520"/>
-        <w:gridCol w:w="2520"/>
-        <w:gridCol w:w="2520"/>
-      </w:tblGrid>
-      <w:tr>
-        <w:tc>
-          <w:tcPr>
-            <w:tcW w:type="dxa" w:w="2592"/>
-            <w:shd w:fill="E65100"/>
-          </w:tcPr>
-          <w:p>
-            <w:pPr>
-              <w:jc w:val="center"/>
-            </w:pPr>
-            <w:r>
-              <w:rPr>
-                <w:b/>
-                <w:color w:val="FFFFFF"/>
-                <w:sz w:val="17"/>
-              </w:rPr>
-              <w:t>Component Name</w:t>
-            </w:r>
-          </w:p>
-        </w:tc>
-        <w:tc>
-          <w:tcPr>
-            <w:tcW w:type="dxa" w:w="1584"/>
-            <w:shd w:fill="E65100"/>
-          </w:tcPr>
-          <w:p>
-            <w:pPr>
-              <w:jc w:val="center"/>
-            </w:pPr>
-            <w:r>
-              <w:rPr>
-                <w:b/>
-                <w:color w:val="FFFFFF"/>
-                <w:sz w:val="17"/>
-              </w:rPr>
-              <w:t>Stereotype</w:t>
-            </w:r>
-          </w:p>
-        </w:tc>
-        <w:tc>
-          <w:tcPr>
-            <w:tcW w:type="dxa" w:w="2880"/>
-            <w:shd w:fill="E65100"/>
-          </w:tcPr>
-          <w:p>
-            <w:pPr>
-              <w:jc w:val="center"/>
-            </w:pPr>
-            <w:r>
-              <w:rPr>
-                <w:b/>
-                <w:color w:val="FFFFFF"/>
-                <w:sz w:val="17"/>
-              </w:rPr>
-              <w:t>Provided Interfaces (Ball)</w:t>
-            </w:r>
-          </w:p>
-        </w:tc>
-        <w:tc>
-          <w:tcPr>
-            <w:tcW w:type="dxa" w:w="3024"/>
-            <w:shd w:fill="E65100"/>
-          </w:tcPr>
-          <w:p>
-            <w:pPr>
-              <w:jc w:val="center"/>
-            </w:pPr>
-            <w:r>
-              <w:rPr>
-                <w:b/>
-                <w:color w:val="FFFFFF"/>
-                <w:sz w:val="17"/>
-              </w:rPr>
-              <w:t>Required Interfaces (Socket)</w:t>
-            </w:r>
-          </w:p>
-        </w:tc>
-      </w:tr>
-      <w:tr>
-        <w:tc>
-          <w:tcPr>
-            <w:tcW w:type="dxa" w:w="2592"/>
-            <w:shd w:fill="FFFFFF"/>
-          </w:tcPr>
-          <w:p>
-            <w:pPr>
-              <w:spacing w:after="40"/>
-            </w:pPr>
-            <w:r>
-              <w:rPr>
-                <w:sz w:val="16"/>
-              </w:rPr>
-              <w:t>Touchscreen Kiosk UI</w:t>
-            </w:r>
-          </w:p>
-        </w:tc>
-        <w:tc>
-          <w:tcPr>
-            <w:tcW w:type="dxa" w:w="1584"/>
-            <w:shd w:fill="FFFFFF"/>
-          </w:tcPr>
-          <w:p>
-            <w:pPr>
-              <w:spacing w:after="40"/>
-            </w:pPr>
-            <w:r>
-              <w:rPr>
-                <w:sz w:val="16"/>
-              </w:rPr>
-              <w:t>&lt;&lt;component&gt;&gt;</w:t>
-            </w:r>
-          </w:p>
-        </w:tc>
-        <w:tc>
-          <w:tcPr>
-            <w:tcW w:type="dxa" w:w="2880"/>
-            <w:shd w:fill="FFFFFF"/>
-          </w:tcPr>
-          <w:p>
-            <w:pPr>
-              <w:spacing w:after="40"/>
-            </w:pPr>
-            <w:r>
-              <w:rPr>
-                <w:sz w:val="16"/>
-              </w:rPr>
-              <w:t>—</w:t>
-            </w:r>
-          </w:p>
-        </w:tc>
-        <w:tc>
-          <w:tcPr>
-            <w:tcW w:type="dxa" w:w="3024"/>
-            <w:shd w:fill="FFFFFF"/>
-          </w:tcPr>
-          <w:p>
-            <w:pPr>
-              <w:spacing w:after="40"/>
-            </w:pPr>
-            <w:r>
-              <w:rPr>
-                <w:sz w:val="16"/>
-              </w:rPr>
-              <w:t>IMenuQuery, IOrderPlacement</w:t>
-            </w:r>
-          </w:p>
-        </w:tc>
-      </w:tr>
-      <w:tr>
-        <w:tc>
-          <w:tcPr>
-            <w:tcW w:type="dxa" w:w="2592"/>
-            <w:shd w:fill="F8F9FA"/>
-          </w:tcPr>
-          <w:p>
-            <w:pPr>
-              <w:spacing w:after="40"/>
-            </w:pPr>
-            <w:r>
-              <w:rPr>
-                <w:sz w:val="16"/>
-              </w:rPr>
-              <w:t>Order Manager Component (Given)</w:t>
-            </w:r>
-          </w:p>
-        </w:tc>
-        <w:tc>
-          <w:tcPr>
-            <w:tcW w:type="dxa" w:w="1584"/>
-            <w:shd w:fill="F8F9FA"/>
-          </w:tcPr>
-          <w:p>
-            <w:pPr>
-              <w:spacing w:after="40"/>
-            </w:pPr>
-            <w:r>
-              <w:rPr>
-                <w:sz w:val="16"/>
-              </w:rPr>
-              <w:t>&lt;&lt;component&gt;&gt;</w:t>
-            </w:r>
-          </w:p>
-        </w:tc>
-        <w:tc>
-          <w:tcPr>
-            <w:tcW w:type="dxa" w:w="2880"/>
-            <w:shd w:fill="F8F9FA"/>
-          </w:tcPr>
-          <w:p>
-            <w:pPr>
-              <w:spacing w:after="40"/>
-            </w:pPr>
-            <w:r>
-              <w:rPr>
-                <w:sz w:val="16"/>
-              </w:rPr>
-              <w:t>IOrderPlacement</w:t>
-            </w:r>
-          </w:p>
-        </w:tc>
-        <w:tc>
-          <w:tcPr>
-            <w:tcW w:type="dxa" w:w="3024"/>
-            <w:shd w:fill="F8F9FA"/>
-          </w:tcPr>
-          <w:p>
-            <w:pPr>
-              <w:spacing w:after="40"/>
-            </w:pPr>
-            <w:r>
-              <w:rPr>
-                <w:sz w:val="16"/>
-              </w:rPr>
-              <w:t>IMenuQuery, IPaymentProcess, IPrintJob</w:t>
-            </w:r>
-          </w:p>
-        </w:tc>
-      </w:tr>
-      <w:tr>
-        <w:tc>
-          <w:tcPr>
-            <w:tcW w:type="dxa" w:w="2592"/>
-            <w:shd w:fill="FFFFFF"/>
-          </w:tcPr>
-          <w:p>
-            <w:pPr>
-              <w:spacing w:after="40"/>
-            </w:pPr>
-            <w:r>
-              <w:rPr>
-                <w:sz w:val="16"/>
-              </w:rPr>
-              <w:t>Payment Service Component (Given)</w:t>
-            </w:r>
-          </w:p>
-        </w:tc>
-        <w:tc>
-          <w:tcPr>
-            <w:tcW w:type="dxa" w:w="1584"/>
-            <w:shd w:fill="FFFFFF"/>
-          </w:tcPr>
-          <w:p>
-            <w:pPr>
-              <w:spacing w:after="40"/>
-            </w:pPr>
-            <w:r>
-              <w:rPr>
-                <w:sz w:val="16"/>
-              </w:rPr>
-              <w:t>&lt;&lt;component&gt;&gt;</w:t>
-            </w:r>
-          </w:p>
-        </w:tc>
-        <w:tc>
-          <w:tcPr>
-            <w:tcW w:type="dxa" w:w="2880"/>
-            <w:shd w:fill="FFFFFF"/>
-          </w:tcPr>
-          <w:p>
-            <w:pPr>
-              <w:spacing w:after="40"/>
-            </w:pPr>
-            <w:r>
-              <w:rPr>
-                <w:sz w:val="16"/>
-              </w:rPr>
-              <w:t>IPaymentProcess</w:t>
-            </w:r>
-          </w:p>
-        </w:tc>
-        <w:tc>
-          <w:tcPr>
-            <w:tcW w:type="dxa" w:w="3024"/>
-            <w:shd w:fill="FFFFFF"/>
-          </w:tcPr>
-          <w:p>
-            <w:pPr>
-              <w:spacing w:after="40"/>
-            </w:pPr>
-            <w:r>
-              <w:rPr>
-                <w:sz w:val="16"/>
-              </w:rPr>
-              <w:t>ICardReaderDriver, IBankGatewayAPI</w:t>
-            </w:r>
-          </w:p>
-        </w:tc>
-      </w:tr>
-      <w:tr>
-        <w:tc>
-          <w:tcPr>
-            <w:tcW w:type="dxa" w:w="2592"/>
-            <w:shd w:fill="F8F9FA"/>
-          </w:tcPr>
-          <w:p>
-            <w:pPr>
-              <w:spacing w:after="40"/>
-            </w:pPr>
-            <w:r>
-              <w:rPr>
-                <w:sz w:val="16"/>
-              </w:rPr>
-              <w:t>Menu &amp; Pricing Catalog</w:t>
-            </w:r>
-          </w:p>
-        </w:tc>
-        <w:tc>
-          <w:tcPr>
-            <w:tcW w:type="dxa" w:w="1584"/>
-            <w:shd w:fill="F8F9FA"/>
-          </w:tcPr>
-          <w:p>
-            <w:pPr>
-              <w:spacing w:after="40"/>
-            </w:pPr>
-            <w:r>
-              <w:rPr>
-                <w:sz w:val="16"/>
-              </w:rPr>
-              <w:t>&lt;&lt;component&gt;&gt;</w:t>
-            </w:r>
-          </w:p>
-        </w:tc>
-        <w:tc>
-          <w:tcPr>
-            <w:tcW w:type="dxa" w:w="2880"/>
-            <w:shd w:fill="F8F9FA"/>
-          </w:tcPr>
-          <w:p>
-            <w:pPr>
-              <w:spacing w:after="40"/>
-            </w:pPr>
-            <w:r>
-              <w:rPr>
-                <w:sz w:val="16"/>
-              </w:rPr>
-              <w:t>IMenuQuery</w:t>
-            </w:r>
-          </w:p>
-        </w:tc>
-        <w:tc>
-          <w:tcPr>
-            <w:tcW w:type="dxa" w:w="3024"/>
-            <w:shd w:fill="F8F9FA"/>
-          </w:tcPr>
-          <w:p>
-            <w:pPr>
-              <w:spacing w:after="40"/>
-            </w:pPr>
-            <w:r>
-              <w:rPr>
-                <w:sz w:val="16"/>
-              </w:rPr>
-              <w:t>ILocalDataQuery (SQLite)</w:t>
-            </w:r>
-          </w:p>
-        </w:tc>
-      </w:tr>
-      <w:tr>
-        <w:tc>
-          <w:tcPr>
-            <w:tcW w:type="dxa" w:w="2592"/>
-            <w:shd w:fill="FFFFFF"/>
-          </w:tcPr>
-          <w:p>
-            <w:pPr>
-              <w:spacing w:after="40"/>
-            </w:pPr>
-            <w:r>
-              <w:rPr>
-                <w:sz w:val="16"/>
-              </w:rPr>
-              <w:t>Printer Controller Component</w:t>
-            </w:r>
-          </w:p>
-        </w:tc>
-        <w:tc>
-          <w:tcPr>
-            <w:tcW w:type="dxa" w:w="1584"/>
-            <w:shd w:fill="FFFFFF"/>
-          </w:tcPr>
-          <w:p>
-            <w:pPr>
-              <w:spacing w:after="40"/>
-            </w:pPr>
-            <w:r>
-              <w:rPr>
-                <w:sz w:val="16"/>
-              </w:rPr>
-              <w:t>&lt;&lt;component&gt;&gt;</w:t>
-            </w:r>
-          </w:p>
-        </w:tc>
-        <w:tc>
-          <w:tcPr>
-            <w:tcW w:type="dxa" w:w="2880"/>
-            <w:shd w:fill="FFFFFF"/>
-          </w:tcPr>
-          <w:p>
-            <w:pPr>
-              <w:spacing w:after="40"/>
-            </w:pPr>
-            <w:r>
-              <w:rPr>
-                <w:sz w:val="16"/>
-              </w:rPr>
-              <w:t>IPrintJob</w:t>
-            </w:r>
-          </w:p>
-        </w:tc>
-        <w:tc>
-          <w:tcPr>
-            <w:tcW w:type="dxa" w:w="3024"/>
-            <w:shd w:fill="FFFFFF"/>
-          </w:tcPr>
-          <w:p>
-            <w:pPr>
-              <w:spacing w:after="40"/>
-            </w:pPr>
-            <w:r>
-              <w:rPr>
-                <w:sz w:val="16"/>
-              </w:rPr>
-              <w:t>IESCPOSDriver (USB Serial)</w:t>
-            </w:r>
-          </w:p>
-        </w:tc>
-      </w:tr>
-    </w:tbl>
     <w:sectPr>
       <w:pgSz w:w="12240" w:h="15840"/>
-      <w:pgMar w:top="1080" w:right="1080" w:bottom="1080" w:left="1080" w:header="720" w:footer="720" w:gutter="0"/>
+      <w:pgMar w:top="864" w:right="864" w:bottom="864" w:left="864" w:header="720" w:footer="720" w:gutter="0"/>
       <w:cols w:space="720"/>
       <w:docGrid w:linePitch="360"/>
     </w:sectPr>

</xml_diff>